<commit_message>
docs(scalp): the weighted chance of target
Corrects the claim that the Opening Scalp's probability is price only
(CLAUDE.md, the five manuals, page_help.py, the page's scorecard note):
the chance of target is a fitted, weekly-refitted model; the bucket
study's rates stay price only; the confirmation word is still recorded
but no longer shown. Adds the factors, scaling, priors, walk-forward
check and Saturday refit to the Technical Reference, the chance fields,
scalp_prob_refit and prob_sources / prob_models to the API Reference,
Chance of target / prior / moving-average slope / RSI to the Glossary,
the page's new column and block to webgui-routes.md, and a CHANGELOG
entry. Manuals rebuilt.

Co-Authored-By: Claude Sonnet 5.5 <noreply@anthropic.com>
</commit_message>
<xml_diff>
--- a/docs/manuals/glossary/glossary.docx
+++ b/docs/manuals/glossary/glossary.docx
@@ -32,7 +32,7 @@
           <w:color w:val="5B6678"/>
           <w:sz w:val="18"/>
         </w:rPr>
-        <w:t>NeuralStrike · Generated 2026-10-20</w:t>
+        <w:t>NeuralStrike · Generated 2026-10-22</w:t>
       </w:r>
     </w:p>
     <w:p/>
@@ -2711,17 +2711,27 @@
       </w:r>
       <w:r>
         <w:rPr/>
-        <w:t xml:space="preserve"> sources agree with a call's direction. On the Opening Scalp's 15-minute calls the sources are options flow, net premium, the dealer read and market sentiment (which counts half as much). It is deliberately </w:t>
+        <w:t xml:space="preserve"> sources agree with a call's direction. On the Opening Scalp's 15-minute calls the sources are options flow, net premium, the dealer read and market sentiment (which counts half as much). It is </w:t>
       </w:r>
       <w:r>
         <w:rPr>
           <w:b/>
         </w:rPr>
-        <w:t>not part of the win probability</w:t>
+        <w:t>no longer shown on the page</w:t>
       </w:r>
       <w:r>
         <w:rPr/>
-        <w:t>: those sources have only a few sessions of history, too little to test, so the app records them every 15 minutes to test later. Read it as a second opinion, never as a chance of winning.</w:t>
+        <w:t xml:space="preserve">, and the word itself is </w:t>
+      </w:r>
+      <w:r>
+        <w:rPr>
+          <w:b/>
+        </w:rPr>
+        <w:t>not part of the chance of target</w:t>
+      </w:r>
+      <w:r>
+        <w:rPr/>
+        <w:t>: the app still records the word and its sources every 15 minutes, and the chance reads those sources as numbers of their own. Read it as a second opinion, never as a chance of winning.</w:t>
       </w:r>
     </w:p>
     <w:p>
@@ -2754,6 +2764,94 @@
       <w:r>
         <w:rPr/>
         <w:t>, against the move the trade needs to reach its target; it also counts how many of the ten big names have the same room. A wall from a chain with no gamma reading (net GEX of zero) is not trusted and counts as no reading.</w:t>
+      </w:r>
+    </w:p>
+    <w:p>
+      <w:r>
+        <w:rPr>
+          <w:b/>
+        </w:rPr>
+        <w:t>Chance of target</w:t>
+      </w:r>
+      <w:r>
+        <w:rPr/>
+        <w:t xml:space="preserve"> — The fitted chance that an Opening Scalp trade </w:t>
+      </w:r>
+      <w:r>
+        <w:rPr>
+          <w:i/>
+        </w:rPr>
+        <w:t>wins</w:t>
+      </w:r>
+      <w:r>
+        <w:rPr/>
+        <w:t xml:space="preserve">, counted the way the usual win rate counts a win (+50% before −50% inside 60 minutes). It is weighted from every factor the app has: price, the slope of a moving average and the RSI on 5-minute, 15-minute and hourly charts, the dealer read, net premium, options flow and sentiment. Its weights are refitted every Saturday and frozen with each call. It sits </w:t>
+      </w:r>
+      <w:r>
+        <w:rPr>
+          <w:i/>
+        </w:rPr>
+        <w:t>beside</w:t>
+      </w:r>
+      <w:r>
+        <w:rPr/>
+        <w:t xml:space="preserve"> the usual win rate, and the line under it says whether it </w:t>
+      </w:r>
+      <w:r>
+        <w:rPr>
+          <w:b/>
+        </w:rPr>
+        <w:t>beat the usual rate on days it was not fitted on</w:t>
+      </w:r>
+      <w:r>
+        <w:rPr/>
+        <w:t>. Read it as a measured estimate with a track record you can see, never as a promise.</w:t>
+      </w:r>
+    </w:p>
+    <w:p>
+      <w:r>
+        <w:rPr>
+          <w:b/>
+        </w:rPr>
+        <w:t>Prior (assumed weight)</w:t>
+      </w:r>
+      <w:r>
+        <w:rPr/>
+        <w:t xml:space="preserve"> — A starting guess for how much a factor should count, written down before the data is looked at. The chance of target begins every factor at a small prior weight, then lets the stored days move it: a factor with months of history moves a long way, one with a few days stays close to its prior. The page marks a weight </w:t>
+      </w:r>
+      <w:r>
+        <w:rPr>
+          <w:b/>
+        </w:rPr>
+        <w:t>assumed</w:t>
+      </w:r>
+      <w:r>
+        <w:rPr/>
+        <w:t xml:space="preserve"> while it rests on fewer than 5 days, meaning the push you are reading is still the guess, not something measured.</w:t>
+      </w:r>
+    </w:p>
+    <w:p>
+      <w:r>
+        <w:rPr>
+          <w:b/>
+        </w:rPr>
+        <w:t>Moving-average slope</w:t>
+      </w:r>
+      <w:r>
+        <w:rPr/>
+        <w:t xml:space="preserve"> — How fast a moving average is rising or falling: here, the percent change of a 20-bar exponential moving average over its last 3 bars. A rising average on the chart the trade is read on agrees with an up call. The chance of target reads it on 5-minute (the main one), 15-minute and hourly bars. It is a trend gauge that lags the price by design.</w:t>
+      </w:r>
+    </w:p>
+    <w:p>
+      <w:r>
+        <w:rPr>
+          <w:b/>
+        </w:rPr>
+        <w:t>RSI (relative strength index)</w:t>
+      </w:r>
+      <w:r>
+        <w:rPr/>
+        <w:t xml:space="preserve"> — A momentum reading from 0 to 100 built from the average size of recent up closes against down closes (here 14 bars, Wilder's smoothing). Above 50 means recent moves have been mostly up, below 50 mostly down; near 100 or 0 is stretched. The chance of target uses its distance from 50, read for the call's direction, on 5-minute, 15-minute and hourly bars.</w:t>
       </w:r>
     </w:p>
     <w:p>

</xml_diff>